<commit_message>
Importance in tests: flagged in the Level row counts, test titles, timed spot test (Which verbs/words? box and printed badge) and Speed Challenge; Spanish and Italian rankings revised after independent check; guides updated
Co-Authored-By: Claude Sonnet 5.5 <noreply@anthropic.com>
Claude-Session: https://claude.ai/code/session_01PyR4m9qw3VZiECsMbL7sBu
</commit_message>
<xml_diff>
--- a/Word documents/Eton_F_Block_Spanish_User_Guide.docx
+++ b/Word documents/Eton_F_Block_Spanish_User_Guide.docx
@@ -11940,6 +11940,40 @@
       <w:r>
         <w:rPr/>
         <w:t xml:space="preserve"> lists them in three groups. Verbs outside the F Block list, and the Advanced Structures, are not graded and always stay in. The choice is forgotten when you close the page.</w:t>
+      </w:r>
+      <w:r>
+        <w:rPr/>
+        <w:t xml:space="preserve"> A red warning shows whenever it is not on </w:t>
+      </w:r>
+      <w:r>
+        <w:rPr>
+          <w:b/>
+        </w:rPr>
+        <w:t>All verbs</w:t>
+      </w:r>
+      <w:r>
+        <w:rPr/>
+        <w:t xml:space="preserve">, so it cannot be missed. In </w:t>
+      </w:r>
+      <w:r>
+        <w:rPr>
+          <w:b/>
+        </w:rPr>
+        <w:t>⏱ Eton Spot Test: timed &amp; submitted</w:t>
+      </w:r>
+      <w:r>
+        <w:rPr/>
+        <w:t xml:space="preserve"> a </w:t>
+      </w:r>
+      <w:r>
+        <w:rPr>
+          <w:b/>
+        </w:rPr>
+        <w:t>Which verbs?</w:t>
+      </w:r>
+      <w:r>
+        <w:rPr/>
+        <w:t xml:space="preserve"> box comes before the Level box: leave it on All verbs unless your teacher has told you otherwise. What you choose is printed at the top of the test, next to the Level. Level (Easy, Medium, Hard) still works as well, and the two combine. In the Speed Challenge the Importance buttons are in the bar and in 📚 Choose verbs.</w:t>
       </w:r>
     </w:p>
     <w:p>

</xml_diff>

<commit_message>
Test Guard: replace the 3-second klaxon with a short "eh-eh" error buzz
Two low square-wave buzzes (about 0.6 s, top rolled off) in place of the harsh
three-blast siren, in the shared Test Guard code in all 19 apps (including both
copies in Eton Gen Essential Phrases). The pause dialog now says "error buzz".
New build ids and versions.json. IGCSE, A Level, F Spanish, F Spanish Start Here
and Olly guides (HTML) and the two F Block Spanish Word guides updated to match.

Co-Authored-By: Claude Sonnet 5.5 <noreply@anthropic.com>
Claude-Session: https://claude.ai/code/session_014gLWoGGRd9x2h9RHd6gB7b
</commit_message>
<xml_diff>
--- a/Word documents/Eton_F_Block_Spanish_User_Guide.docx
+++ b/Word documents/Eton_F_Block_Spanish_User_Guide.docx
@@ -5257,7 +5257,7 @@
                 <w:sz w:val="21"/>
                 <w:szCs w:val="21"/>
               </w:rPr>
-              <w:t xml:space="preserve"> If you switch to another app or tab, use Split View, reload or press Back, a loud 3 second siren sounds and a red warning flashes. The attempt is </w:t>
+              <w:t xml:space="preserve"> If you switch to another app or tab, use Split View, reload or press Back, an error buzz sounds and a red warning flashes. The attempt is </w:t>
             </w:r>
             <w:r>
               <w:rPr>
@@ -7717,7 +7717,7 @@
           <w:sz w:val="22"/>
           <w:szCs w:val="22"/>
         </w:rPr>
-        <w:t xml:space="preserve">Leaving the page sounds the siren and is logged.</w:t>
+        <w:t xml:space="preserve">Leaving the page sounds the error buzz and is logged.</w:t>
       </w:r>
     </w:p>
     <w:p>
@@ -11325,7 +11325,7 @@
           <w:sz w:val="22"/>
           <w:szCs w:val="22"/>
         </w:rPr>
-        <w:t xml:space="preserve">Do not leave the page during a timed test or a loud siren sounds.</w:t>
+        <w:t xml:space="preserve">Do not leave the page during a timed test or an error buzz sounds.</w:t>
       </w:r>
       <w:r>
         <w:rPr>
@@ -14837,7 +14837,7 @@
                 <w:sz w:val="20"/>
                 <w:szCs w:val="20"/>
               </w:rPr>
-              <w:t xml:space="preserve">The siren went off</w:t>
+              <w:t xml:space="preserve">The error buzz sounded</w:t>
             </w:r>
           </w:p>
         </w:tc>

</xml_diff>